<commit_message>
Revert "Fix 68 audited bugs: PDF generation, WhatsApp queue, docx placeholders, error logging"
</commit_message>
<xml_diff>
--- a/mgmt/frontend/public/sample-templates/report-hi-sample.docx
+++ b/mgmt/frontend/public/sample-templates/report-hi-sample.docx
@@ -296,7 +296,7 @@
                 <w:i w:val="0"/>
                 <w:sz w:val="18"/>
               </w:rPr>
-              <w:t>{#loans}{LOAN_TAKER_HI}</w:t>
+              <w:t>{#loans}{LOAN_TAKER}</w:t>
             </w:r>
           </w:p>
         </w:tc>
@@ -368,7 +368,7 @@
                 <w:i w:val="0"/>
                 <w:sz w:val="18"/>
               </w:rPr>
-              <w:t>{STATUS_HI}{/loans}</w:t>
+              <w:t>{STATUS}{/loans}</w:t>
             </w:r>
           </w:p>
         </w:tc>
@@ -499,7 +499,7 @@
                 <w:i w:val="0"/>
                 <w:sz w:val="18"/>
               </w:rPr>
-              <w:t>{#guarantors}{GUARANTOR_NAME_HI}</w:t>
+              <w:t>{#guarantors}{GUARANTOR_NAME}</w:t>
             </w:r>
           </w:p>
         </w:tc>
@@ -517,7 +517,7 @@
                 <w:i w:val="0"/>
                 <w:sz w:val="18"/>
               </w:rPr>
-              <w:t>{LOAN_TAKER_HI}</w:t>
+              <w:t>{LOAN_TAKER}</w:t>
             </w:r>
           </w:p>
         </w:tc>
@@ -772,7 +772,7 @@
                 <w:i w:val="0"/>
                 <w:sz w:val="18"/>
               </w:rPr>
-              <w:t>{NAME_HI}</w:t>
+              <w:t>{NAME}</w:t>
             </w:r>
           </w:p>
         </w:tc>
@@ -790,7 +790,7 @@
                 <w:i w:val="0"/>
                 <w:sz w:val="18"/>
               </w:rPr>
-              <w:t>{FATHER_NAME_HI}</w:t>
+              <w:t>{FATHER_NAME}</w:t>
             </w:r>
           </w:p>
         </w:tc>
@@ -808,7 +808,7 @@
                 <w:i w:val="0"/>
                 <w:sz w:val="18"/>
               </w:rPr>
-              <w:t>{VILLAGE_HI}</w:t>
+              <w:t>{VILLAGE}</w:t>
             </w:r>
           </w:p>
         </w:tc>
@@ -1041,7 +1041,7 @@
                 <w:i w:val="0"/>
                 <w:sz w:val="18"/>
               </w:rPr>
-              <w:t>{DESCRIPTION_HI}</w:t>
+              <w:t>{DESCRIPTION}</w:t>
             </w:r>
           </w:p>
         </w:tc>
@@ -1059,7 +1059,7 @@
                 <w:i w:val="0"/>
                 <w:sz w:val="18"/>
               </w:rPr>
-              <w:t>{CATEGORY_HI}</w:t>
+              <w:t>{CATEGORY}</w:t>
             </w:r>
           </w:p>
         </w:tc>

</xml_diff>